<commit_message>
Separating into execution and subroutines program files.
</commit_message>
<xml_diff>
--- a/colorcode.docx
+++ b/colorcode.docx
@@ -512,9 +512,13 @@
               <w:pStyle w:val="TableContents"/>
               <w:rPr>
                 <w:rFonts w:hint="eastAsia"/>
-              </w:rPr>
-            </w:pPr>
-            <w:r>
+                <w:i/>
+              </w:rPr>
+            </w:pPr>
+            <w:r>
+              <w:rPr>
+                <w:i/>
+              </w:rPr>
               <w:t>(default=“green yellow red”)</w:t>
             </w:r>
           </w:p>
@@ -645,7 +649,12 @@
               <w:t>d</w:t>
             </w:r>
             <w:r>
-              <w:t xml:space="preserve"> by 6.</w:t>
+              <w:t xml:space="preserve"> by 12</w:t>
+            </w:r>
+            <w:bookmarkStart w:id="0" w:name="_GoBack"/>
+            <w:bookmarkEnd w:id="0"/>
+            <w:r>
+              <w:t>.</w:t>
             </w:r>
           </w:p>
         </w:tc>
@@ -695,9 +704,13 @@
               <w:pStyle w:val="TableContents"/>
               <w:rPr>
                 <w:rFonts w:hint="eastAsia"/>
-              </w:rPr>
-            </w:pPr>
-            <w:r>
+                <w:i/>
+              </w:rPr>
+            </w:pPr>
+            <w:r>
+              <w:rPr>
+                <w:i/>
+              </w:rPr>
               <w:t>(default=”all”)</w:t>
             </w:r>
           </w:p>
@@ -809,9 +822,13 @@
               <w:pStyle w:val="TableContents"/>
               <w:rPr>
                 <w:rFonts w:hint="eastAsia"/>
-              </w:rPr>
-            </w:pPr>
-            <w:r>
+                <w:i/>
+              </w:rPr>
+            </w:pPr>
+            <w:r>
+              <w:rPr>
+                <w:i/>
+              </w:rPr>
               <w:t>(default=”f”)</w:t>
             </w:r>
           </w:p>
@@ -900,6 +917,9 @@
           <w:p>
             <w:pPr>
               <w:pStyle w:val="TableContents"/>
+              <w:rPr>
+                <w:rFonts w:hint="eastAsia"/>
+              </w:rPr>
             </w:pPr>
             <w:r>
               <w:t>QUANTILES=</w:t>
@@ -916,8 +936,15 @@
           <w:p>
             <w:pPr>
               <w:pStyle w:val="TableContents"/>
-            </w:pPr>
-            <w:r>
+              <w:rPr>
+                <w:rFonts w:hint="eastAsia"/>
+                <w:i/>
+              </w:rPr>
+            </w:pPr>
+            <w:r>
+              <w:rPr>
+                <w:i/>
+              </w:rPr>
               <w:t>(default=”f”)</w:t>
             </w:r>
           </w:p>
@@ -1000,24 +1027,35 @@
           <w:p>
             <w:pPr>
               <w:pStyle w:val="TableContents"/>
-            </w:pPr>
-            <w:r>
-              <w:t>KEEP_TABLES</w:t>
+              <w:rPr>
+                <w:rFonts w:hint="eastAsia"/>
+              </w:rPr>
+            </w:pPr>
+            <w:r>
+              <w:t>STATISTICS</w:t>
             </w:r>
             <w:r>
               <w:t>=</w:t>
             </w:r>
-            <w:bookmarkStart w:id="0" w:name="_GoBack"/>
             <w:proofErr w:type="spellStart"/>
             <w:r>
               <w:rPr>
                 <w:i/>
-                <w:u w:val="single"/>
               </w:rPr>
               <w:t>arg</w:t>
             </w:r>
-            <w:bookmarkEnd w:id="0"/>
             <w:proofErr w:type="spellEnd"/>
+          </w:p>
+          <w:p>
+            <w:pPr>
+              <w:pStyle w:val="TableContents"/>
+            </w:pPr>
+            <w:r>
+              <w:rPr>
+                <w:i/>
+              </w:rPr>
+              <w:t>(default=”f”)</w:t>
+            </w:r>
           </w:p>
         </w:tc>
         <w:tc>
@@ -1042,6 +1080,146 @@
               <w:pStyle w:val="TableContents"/>
             </w:pPr>
             <w:r>
+              <w:t xml:space="preserve">List of summary statistics for each column to be included at the bottom of the table. The summary statistics can be ‘mean’ (average of </w:t>
+            </w:r>
+            <w:proofErr w:type="spellStart"/>
+            <w:r>
+              <w:t>alle</w:t>
+            </w:r>
+            <w:proofErr w:type="spellEnd"/>
+            <w:r>
+              <w:t xml:space="preserve"> values), ‘</w:t>
+            </w:r>
+            <w:proofErr w:type="spellStart"/>
+            <w:r>
+              <w:t>stdev</w:t>
+            </w:r>
+            <w:proofErr w:type="spellEnd"/>
+            <w:r>
+              <w:t>’ (standard deviation), ‘min’ (minimum), ‘max’ (maximum), and ‘quartiles’ (1</w:t>
+            </w:r>
+            <w:r>
+              <w:rPr>
+                <w:vertAlign w:val="superscript"/>
+              </w:rPr>
+              <w:t>st</w:t>
+            </w:r>
+            <w:r>
+              <w:t xml:space="preserve"> and 3</w:t>
+            </w:r>
+            <w:r>
+              <w:rPr>
+                <w:vertAlign w:val="superscript"/>
+              </w:rPr>
+              <w:t>rd</w:t>
+            </w:r>
+            <w:r>
+              <w:t xml:space="preserve"> quartile value).</w:t>
+            </w:r>
+          </w:p>
+          <w:p>
+            <w:pPr>
+              <w:pStyle w:val="TableContents"/>
+            </w:pPr>
+            <w:r>
+              <w:rPr>
+                <w:b/>
+              </w:rPr>
+              <w:t>Note</w:t>
+            </w:r>
+            <w:r>
+              <w:t>: This applies only when ‘</w:t>
+            </w:r>
+            <w:proofErr w:type="spellStart"/>
+            <w:r>
+              <w:t>bytype</w:t>
+            </w:r>
+            <w:proofErr w:type="spellEnd"/>
+            <w:r>
+              <w:t>=cols’.</w:t>
+            </w:r>
+          </w:p>
+        </w:tc>
+      </w:tr>
+      <w:tr>
+        <w:tc>
+          <w:tcPr>
+            <w:tcW w:w="3600" w:type="dxa"/>
+            <w:tcBorders>
+              <w:top w:val="single" w:sz="2" w:space="0" w:color="000000"/>
+              <w:left w:val="single" w:sz="2" w:space="0" w:color="000000"/>
+              <w:bottom w:val="single" w:sz="2" w:space="0" w:color="000000"/>
+            </w:tcBorders>
+            <w:shd w:val="clear" w:color="auto" w:fill="D9D9D9" w:themeFill="background1" w:themeFillShade="D9"/>
+            <w:tcMar>
+              <w:top w:w="55" w:type="dxa"/>
+              <w:left w:w="55" w:type="dxa"/>
+              <w:bottom w:w="55" w:type="dxa"/>
+              <w:right w:w="55" w:type="dxa"/>
+            </w:tcMar>
+          </w:tcPr>
+          <w:p>
+            <w:pPr>
+              <w:pStyle w:val="TableContents"/>
+              <w:rPr>
+                <w:i/>
+              </w:rPr>
+            </w:pPr>
+            <w:r>
+              <w:t>KEEP_TABLE</w:t>
+            </w:r>
+            <w:r>
+              <w:t>=</w:t>
+            </w:r>
+            <w:proofErr w:type="spellStart"/>
+            <w:r>
+              <w:rPr>
+                <w:i/>
+              </w:rPr>
+              <w:t>arg</w:t>
+            </w:r>
+            <w:proofErr w:type="spellEnd"/>
+          </w:p>
+          <w:p>
+            <w:pPr>
+              <w:pStyle w:val="TableContents"/>
+              <w:rPr>
+                <w:rFonts w:hint="eastAsia"/>
+              </w:rPr>
+            </w:pPr>
+            <w:r>
+              <w:rPr>
+                <w:i/>
+              </w:rPr>
+              <w:t>(default=”f”)</w:t>
+            </w:r>
+          </w:p>
+        </w:tc>
+        <w:tc>
+          <w:tcPr>
+            <w:tcW w:w="4950" w:type="dxa"/>
+            <w:tcBorders>
+              <w:top w:val="single" w:sz="2" w:space="0" w:color="000000"/>
+              <w:left w:val="single" w:sz="2" w:space="0" w:color="000000"/>
+              <w:bottom w:val="single" w:sz="2" w:space="0" w:color="000000"/>
+              <w:right w:val="single" w:sz="2" w:space="0" w:color="000000"/>
+            </w:tcBorders>
+            <w:shd w:val="clear" w:color="auto" w:fill="D9D9D9" w:themeFill="background1" w:themeFillShade="D9"/>
+            <w:tcMar>
+              <w:top w:w="55" w:type="dxa"/>
+              <w:left w:w="55" w:type="dxa"/>
+              <w:bottom w:w="55" w:type="dxa"/>
+              <w:right w:w="55" w:type="dxa"/>
+            </w:tcMar>
+          </w:tcPr>
+          <w:p>
+            <w:pPr>
+              <w:pStyle w:val="TableContents"/>
+              <w:rPr>
+                <w:rFonts w:hint="eastAsia"/>
+              </w:rPr>
+            </w:pPr>
+            <w:r>
               <w:t xml:space="preserve">Indicator whether </w:t>
             </w:r>
             <w:r>
@@ -1075,7 +1253,14 @@
               </w:rPr>
             </w:pPr>
             <w:r>
-              <w:t>Note: The table is named ‘</w:t>
+              <w:rPr>
+                <w:b/>
+              </w:rPr>
+              <w:lastRenderedPageBreak/>
+              <w:t>Note</w:t>
+            </w:r>
+            <w:r>
+              <w:t>: The table is named ‘</w:t>
             </w:r>
             <w:proofErr w:type="spellStart"/>
             <w:r>
@@ -1191,7 +1376,6 @@
       </w:pPr>
       <w:proofErr w:type="gramStart"/>
       <w:r>
-        <w:lastRenderedPageBreak/>
         <w:t>will</w:t>
       </w:r>
       <w:proofErr w:type="gramEnd"/>
@@ -1463,11 +1647,18 @@
         <w:t xml:space="preserve"> or</w:t>
       </w:r>
       <w:r>
-        <w:t xml:space="preserve">. If you'd like to contribute to the project, please feel free to send a pull request to </w:t>
+        <w:t>. If you'd like to contribute to the project, please feel free to send a pull request to</w:t>
+      </w:r>
+      <w:r>
+        <w:t xml:space="preserve"> </w:t>
       </w:r>
       <w:hyperlink r:id="rId6" w:history="1">
         <w:r>
-          <w:t>https://github.com/jameslamb/ML4EVIEWS/tree/master/tscval</w:t>
+          <w:rPr>
+            <w:rStyle w:val="Hyperlink"/>
+            <w:rFonts w:hint="eastAsia"/>
+          </w:rPr>
+          <w:t>https://github.com/CrisisStudent/ColorCode</w:t>
         </w:r>
       </w:hyperlink>
       <w:r>
@@ -1521,12 +1712,28 @@
     <w:p>
       <w:pPr>
         <w:pStyle w:val="NoSpacing"/>
-        <w:rPr>
-          <w:rFonts w:hint="eastAsia"/>
-        </w:rPr>
       </w:pPr>
       <w:r>
         <w:t>For large tables it is better to execute this procedure in command line, since having the table open causes the color-coding to be slow in Eviews.</w:t>
+      </w:r>
+    </w:p>
+    <w:p>
+      <w:pPr>
+        <w:pStyle w:val="NoSpacing"/>
+        <w:rPr>
+          <w:rFonts w:hint="eastAsia"/>
+        </w:rPr>
+      </w:pPr>
+      <w:r>
+        <w:t xml:space="preserve">The add-in is separated into </w:t>
+      </w:r>
+      <w:proofErr w:type="spellStart"/>
+      <w:r>
+        <w:t>settings&amp;execution</w:t>
+      </w:r>
+      <w:proofErr w:type="spellEnd"/>
+      <w:r>
+        <w:t xml:space="preserve"> program file and subroutines program file. This allows developers to repurpose the subroutine(s) outside of the add-in.   </w:t>
       </w:r>
     </w:p>
     <w:p>

</xml_diff>